<commit_message>
Draw Figures 1 and 3 for the disclosure
Figure 1 is the architecture, with the feedback path from completed jobs
into the per-class cost models drawn as the highlighted loop, because that
loop is what is being claimed rather than the pipeline it wraps. M2 and M3
are drawn on two rails: they run concurrently, and a serial row would have
misdescribed the system in a document where that matters.

Figure 3 is the routing decision transcribed from server/scheduler.py
rather than from a description of it. It has the three sources a prediction
can come from and all four selection branches in the order the code tries
them — probe an unmeasured class, probe a thinly-measured one that still
meets the deadline, otherwise the cheapest that meets it, and only when
nothing does, the fastest with the overrun reported in advance.

Both regenerate from ip/make_figures.py, so a figure cannot drift from the
code it describes without someone noticing.

Co-Authored-By: Claude Opus 5 <noreply@anthropic.com>
</commit_message>
<xml_diff>
--- a/ip/IDF-B-Patent-SLA-Scheduler-FILLED.docx
+++ b/ip/IDF-B-Patent-SLA-Scheduler-FILLED.docx
@@ -549,7 +549,7 @@
         <w:spacing w:after="40"/>
       </w:pPr>
       <w:r>
-        <w:t>Figure 1 — System architecture: job intake, routing decision, worker fleet, and the feedback path from completed jobs into the per-class cost models.</w:t>
+        <w:t>Figure 1 — System architecture: job intake, the allowance check, the routing decision, the worker fleet, the pipeline stages, and the feedback path from completed jobs into the per-class cost models. Supplied as ip/figure1-architecture.png.</w:t>
       </w:r>
     </w:p>
     <w:p>
@@ -558,7 +558,7 @@
         <w:spacing w:after="40"/>
       </w:pPr>
       <w:r>
-        <w:t>Figure 2 — Measured execution time against input length, per hardware class, with the fitted affine model and, for contrast, a constant-rate model fitted only on short inputs. Supplied as ip/figure2-cost-model.png and regenerated from the recorded observations by ip/make_figure2.py.</w:t>
+        <w:t>Figure 2 — Measured execution time against input length, per hardware class, with the fitted affine model and, for contrast, a constant-rate model fitted only on short inputs. Supplied as ip/figure2-cost-model.png and regenerated from the recorded observations by ip/make_figure2.py; Figures 1 and 3 by ip/make_figures.py.</w:t>
       </w:r>
     </w:p>
     <w:p>
@@ -567,7 +567,7 @@
         <w:spacing w:after="40"/>
       </w:pPr>
       <w:r>
-        <w:t>Figure 3 — Flowchart of the routing decision, including the unmeasured-class sampling rule and the deadline-miss path.</w:t>
+        <w:t>Figure 3 — Flowchart of the routing decision as implemented: the three sources a prediction may come from, the two exploration branches, the cheapest-that-meets-it rule and the deadline-miss path. Supplied as ip/figure3-routing.png.</w:t>
       </w:r>
     </w:p>
     <w:p>

</xml_diff>

<commit_message>
Embed the drawings in the patent disclosure
Item 7 asks for the drawings to be included, not referenced. The form was
travelling as a document plus three loose PNGs beside it, which is a form
whose figures can be separated from it on the way to the IPR Cell.

All three are now inline under item 7 with their captions. The generators
stay in the repository, so the figures can still be rebuilt from the code
and the recorded observations.

Co-Authored-By: Claude Opus 5 <noreply@anthropic.com>
</commit_message>
<xml_diff>
--- a/ip/IDF-B-Patent-SLA-Scheduler-FILLED.docx
+++ b/ip/IDF-B-Patent-SLA-Scheduler-FILLED.docx
@@ -568,6 +568,162 @@
       </w:pPr>
       <w:r>
         <w:t>Figure 3 — Flowchart of the routing decision as implemented: the three sources a prediction may come from, the two exploration branches, the cheapest-that-meets-it rule and the deadline-miss path. Supplied as ip/figure3-routing.png.</w:t>
+      </w:r>
+    </w:p>
+    <w:p>
+      <w:pPr>
+        <w:jc w:val="center"/>
+      </w:pPr>
+      <w:r>
+        <w:drawing>
+          <wp:inline xmlns:a="http://schemas.openxmlformats.org/drawingml/2006/main" xmlns:pic="http://schemas.openxmlformats.org/drawingml/2006/picture">
+            <wp:extent cx="5852160" cy="3211665"/>
+            <wp:docPr id="1" name="Picture 1"/>
+            <wp:cNvGraphicFramePr>
+              <a:graphicFrameLocks noChangeAspect="1"/>
+            </wp:cNvGraphicFramePr>
+            <a:graphic>
+              <a:graphicData uri="http://schemas.openxmlformats.org/drawingml/2006/picture">
+                <pic:pic>
+                  <pic:nvPicPr>
+                    <pic:cNvPr id="0" name="figure1-architecture.png"/>
+                    <pic:cNvPicPr/>
+                  </pic:nvPicPr>
+                  <pic:blipFill>
+                    <a:blip r:embed="rId9"/>
+                    <a:stretch>
+                      <a:fillRect/>
+                    </a:stretch>
+                  </pic:blipFill>
+                  <pic:spPr>
+                    <a:xfrm>
+                      <a:off x="0" y="0"/>
+                      <a:ext cx="5852160" cy="3211665"/>
+                    </a:xfrm>
+                    <a:prstGeom prst="rect"/>
+                  </pic:spPr>
+                </pic:pic>
+              </a:graphicData>
+            </a:graphic>
+          </wp:inline>
+        </w:drawing>
+      </w:r>
+    </w:p>
+    <w:p>
+      <w:pPr>
+        <w:spacing w:after="200"/>
+        <w:jc w:val="center"/>
+      </w:pPr>
+      <w:r>
+        <w:rPr>
+          <w:i/>
+          <w:sz w:val="18"/>
+        </w:rPr>
+        <w:t>Figure 1 — System architecture. The highlighted loop is the invention: every completed job updates its hardware class's cost model, and that model decides where the next job runs.</w:t>
+      </w:r>
+    </w:p>
+    <w:p>
+      <w:pPr>
+        <w:jc w:val="center"/>
+      </w:pPr>
+      <w:r>
+        <w:drawing>
+          <wp:inline xmlns:a="http://schemas.openxmlformats.org/drawingml/2006/main" xmlns:pic="http://schemas.openxmlformats.org/drawingml/2006/picture">
+            <wp:extent cx="5852160" cy="2877312"/>
+            <wp:docPr id="2" name="Picture 2"/>
+            <wp:cNvGraphicFramePr>
+              <a:graphicFrameLocks noChangeAspect="1"/>
+            </wp:cNvGraphicFramePr>
+            <a:graphic>
+              <a:graphicData uri="http://schemas.openxmlformats.org/drawingml/2006/picture">
+                <pic:pic>
+                  <pic:nvPicPr>
+                    <pic:cNvPr id="0" name="figure2-cost-model.png"/>
+                    <pic:cNvPicPr/>
+                  </pic:nvPicPr>
+                  <pic:blipFill>
+                    <a:blip r:embed="rId10"/>
+                    <a:stretch>
+                      <a:fillRect/>
+                    </a:stretch>
+                  </pic:blipFill>
+                  <pic:spPr>
+                    <a:xfrm>
+                      <a:off x="0" y="0"/>
+                      <a:ext cx="5852160" cy="2877312"/>
+                    </a:xfrm>
+                    <a:prstGeom prst="rect"/>
+                  </pic:spPr>
+                </pic:pic>
+              </a:graphicData>
+            </a:graphic>
+          </wp:inline>
+        </w:drawing>
+      </w:r>
+    </w:p>
+    <w:p>
+      <w:pPr>
+        <w:spacing w:after="200"/>
+        <w:jc w:val="center"/>
+      </w:pPr>
+      <w:r>
+        <w:rPr>
+          <w:i/>
+          <w:sz w:val="18"/>
+        </w:rPr>
+        <w:t>Figure 2 — Measured execution cost against input length, per hardware class, with the fitted affine model and a constant-rate model fitted only on short inputs.</w:t>
+      </w:r>
+    </w:p>
+    <w:p>
+      <w:pPr>
+        <w:jc w:val="center"/>
+      </w:pPr>
+      <w:r>
+        <w:drawing>
+          <wp:inline xmlns:a="http://schemas.openxmlformats.org/drawingml/2006/main" xmlns:pic="http://schemas.openxmlformats.org/drawingml/2006/picture">
+            <wp:extent cx="5852160" cy="5100506"/>
+            <wp:docPr id="3" name="Picture 3"/>
+            <wp:cNvGraphicFramePr>
+              <a:graphicFrameLocks noChangeAspect="1"/>
+            </wp:cNvGraphicFramePr>
+            <a:graphic>
+              <a:graphicData uri="http://schemas.openxmlformats.org/drawingml/2006/picture">
+                <pic:pic>
+                  <pic:nvPicPr>
+                    <pic:cNvPr id="0" name="figure3-routing.png"/>
+                    <pic:cNvPicPr/>
+                  </pic:nvPicPr>
+                  <pic:blipFill>
+                    <a:blip r:embed="rId11"/>
+                    <a:stretch>
+                      <a:fillRect/>
+                    </a:stretch>
+                  </pic:blipFill>
+                  <pic:spPr>
+                    <a:xfrm>
+                      <a:off x="0" y="0"/>
+                      <a:ext cx="5852160" cy="5100506"/>
+                    </a:xfrm>
+                    <a:prstGeom prst="rect"/>
+                  </pic:spPr>
+                </pic:pic>
+              </a:graphicData>
+            </a:graphic>
+          </wp:inline>
+        </w:drawing>
+      </w:r>
+    </w:p>
+    <w:p>
+      <w:pPr>
+        <w:spacing w:after="200"/>
+        <w:jc w:val="center"/>
+      </w:pPr>
+      <w:r>
+        <w:rPr>
+          <w:i/>
+          <w:sz w:val="18"/>
+        </w:rPr>
+        <w:t>Figure 3 — The routing decision as implemented.</w:t>
       </w:r>
     </w:p>
     <w:p>

</xml_diff>

<commit_message>
Title the disclosure in the form a patent office expects
The plain-language version read like a product description rather than an
invention title. Item 1 now uses the conventional System and Method
phrasing, naming the three things that distinguish the claim — the
deadline, the heterogeneous hardware, and the cost model that learns
itself — in about twenty words that a reader can still follow.

The full scope stays underneath, so nothing is lost by the shorter form.

Co-Authored-By: Claude Opus 5 <noreply@anthropic.com>
</commit_message>
<xml_diff>
--- a/ip/IDF-B-Patent-SLA-Scheduler-FILLED.docx
+++ b/ip/IDF-B-Patent-SLA-Scheduler-FILLED.docx
@@ -32,7 +32,7 @@
         <w:rPr>
           <w:i w:val="0"/>
         </w:rPr>
-        <w:t>Deadline-constrained scheduling of multimodal video-understanding workloads by jointly selecting a hardware class and a model-fidelity configuration, using a per-class execution-cost model learned online as an affine function of input length.</w:t>
+        <w:t>System and Method for Deadline-Aware Scheduling of Video-Processing Workloads Across Heterogeneous Hardware Using a Self-Learning Execution-Cost Model</w:t>
       </w:r>
     </w:p>
     <w:p>
@@ -40,7 +40,14 @@
         <w:rPr>
           <w:i w:val="0"/>
         </w:rPr>
-        <w:t>Short title: Cost-aware, SLA-constrained scheduler with online affine cost learning for heterogeneous inference fleets.</w:t>
+      </w:r>
+    </w:p>
+    <w:p>
+      <w:r>
+        <w:rPr>
+          <w:i/>
+        </w:rPr>
+        <w:t>Scope, stated in full: scheduling of multimodal video-understanding workloads under a wall-clock deadline, in which a hardware class and a model-fidelity configuration are selected jointly, and in which the execution cost of each hardware class is maintained as an affine function of input length, fitted online from completed jobs.</w:t>
       </w:r>
     </w:p>
     <w:p>
@@ -713,7 +720,7 @@
       <w:r>
         <w:drawing>
           <wp:inline xmlns:a="http://schemas.openxmlformats.org/drawingml/2006/main" xmlns:pic="http://schemas.openxmlformats.org/drawingml/2006/picture">
-            <wp:extent cx="5760720" cy="5020811"/>
+            <wp:extent cx="5760720" cy="6582547"/>
             <wp:docPr id="3" name="Picture 3"/>
             <wp:cNvGraphicFramePr>
               <a:graphicFrameLocks noChangeAspect="1"/>
@@ -734,7 +741,7 @@
                   <pic:spPr>
                     <a:xfrm>
                       <a:off x="0" y="0"/>
-                      <a:ext cx="5760720" cy="5020811"/>
+                      <a:ext cx="5760720" cy="6582547"/>
                     </a:xfrm>
                     <a:prstGeom prst="rect"/>
                   </pic:spPr>

</xml_diff>